<commit_message>
Agregar a Noe Guillermo Euan Herrera y nombrar en las diapositivas las piezas de la rubrica.
El equipo queda en cuatro integrantes y las laminas dicen cliente, servidor, archivo de configuracion y servicio en la nube.

Co-authored-by: Cursor <cursoragent@cursor.com>
</commit_message>
<xml_diff>
--- a/equipo4_aws_reporte.docx
+++ b/equipo4_aws_reporte.docx
@@ -305,6 +305,22 @@
                 <w:sz w:val="24"/>
               </w:rPr>
               <w:t>Luis Enrique Ramos Díaz</w:t>
+            </w:r>
+          </w:p>
+          <w:p>
+            <w:pPr>
+              <w:spacing w:before="0" w:after="0" w:line="240" w:lineRule="auto"/>
+              <w:jc w:val="left"/>
+            </w:pPr>
+            <w:r>
+              <w:rPr>
+                <w:rFonts w:ascii="Calibri" w:hAnsi="Calibri" w:eastAsia="Calibri"/>
+                <w:b w:val="0"/>
+                <w:i w:val="0"/>
+                <w:color w:val="1A1F26"/>
+                <w:sz w:val="24"/>
+              </w:rPr>
+              <w:t>Noé Guillermo Euan Herrera</w:t>
             </w:r>
           </w:p>
         </w:tc>

</xml_diff>